<commit_message>
Invoice templates: match Elegant docx/xlsx to the live tool design
Elegant was still using the early Arial + yellow header treatment. The
live tool's Elegant template has been Georgia serif on an indigo accent
since the template-redesign commit, so the downloadable docx and xlsx
were drifting from the on-screen preview.

 - build-templates.js: Elegant headingFont -> Georgia, accent -> indigo
   (6366F1), header fill cleared. Elegant joins Ribbon in drawing a thin
   accent rule under the INVOICE cell instead of filling the header.
 - template-assets.json: new Google Docs copy URL pointing at the
   redesigned Elegant doc.
 - templates/*.docx and *.xlsx: regenerated by the build script so all
   five styles ship as a matching set.

Co-Authored-By: Claude Opus 4.7 (1M context) <noreply@anthropic.com>
</commit_message>
<xml_diff>
--- a/invoice-generator/templates/elegant.docx
+++ b/invoice-generator/templates/elegant.docx
@@ -78,10 +78,9 @@
             <w:tcBorders>
               <w:top w:val="none" w:color="FFFFFF" w:sz="0"/>
               <w:left w:val="none" w:color="FFFFFF" w:sz="0"/>
-              <w:bottom w:val="none" w:color="FFFFFF" w:sz="0"/>
+              <w:bottom w:val="single" w:color="6366F1" w:sz="6"/>
               <w:right w:val="none" w:color="FFFFFF" w:sz="0"/>
             </w:tcBorders>
-            <w:shd w:fill="FBBF24" w:color="auto" w:val="clear"/>
           </w:tcPr>
           <w:p>
             <w:pPr>
@@ -90,10 +89,10 @@
             </w:pPr>
             <w:r>
               <w:rPr>
-                <w:rFonts w:ascii="Arial" w:cs="Arial" w:eastAsia="Arial" w:hAnsi="Arial"/>
+                <w:rFonts w:ascii="Georgia" w:cs="Georgia" w:eastAsia="Georgia" w:hAnsi="Georgia"/>
                 <w:b/>
                 <w:bCs/>
-                <w:color w:val="1A1A1A"/>
+                <w:color w:val="6366F1"/>
                 <w:sz w:val="44"/>
                 <w:szCs w:val="44"/>
               </w:rPr>
@@ -299,7 +298,7 @@
         <w:tc>
           <w:tcPr>
             <w:tcW w:type="dxa" w:w="4680"/>
-            <w:shd w:fill="FBBF24" w:color="auto" w:val="clear"/>
+            <w:shd w:fill="F3F5F8" w:color="auto" w:val="clear"/>
           </w:tcPr>
           <w:p>
             <w:pPr>
@@ -320,7 +319,7 @@
         <w:tc>
           <w:tcPr>
             <w:tcW w:type="dxa" w:w="936"/>
-            <w:shd w:fill="FBBF24" w:color="auto" w:val="clear"/>
+            <w:shd w:fill="F3F5F8" w:color="auto" w:val="clear"/>
           </w:tcPr>
           <w:p>
             <w:pPr>
@@ -341,7 +340,7 @@
         <w:tc>
           <w:tcPr>
             <w:tcW w:type="dxa" w:w="1872"/>
-            <w:shd w:fill="FBBF24" w:color="auto" w:val="clear"/>
+            <w:shd w:fill="F3F5F8" w:color="auto" w:val="clear"/>
           </w:tcPr>
           <w:p>
             <w:pPr>
@@ -362,7 +361,7 @@
         <w:tc>
           <w:tcPr>
             <w:tcW w:type="dxa" w:w="1872"/>
-            <w:shd w:fill="FBBF24" w:color="auto" w:val="clear"/>
+            <w:shd w:fill="F3F5F8" w:color="auto" w:val="clear"/>
           </w:tcPr>
           <w:p>
             <w:pPr>

</xml_diff>